<commit_message>
Netinho: revisão da Parte 1
Co-Authored-By: Claude Opus 5.5 <noreply@anthropic.com>
Claude-Session: https://claude.ai/code/session_01MJjUEEZrxQDEUifKK2vj9g
</commit_message>
<xml_diff>
--- a/roteiros/netinho/Netinho_Parte1.docx
+++ b/roteiros/netinho/Netinho_Parte1.docx
@@ -23,7 +23,7 @@
         <w:rPr>
           <w:color w:val="C00000"/>
         </w:rPr>
-        <w:t>O que pouca gente sabe é que ele sobreviveu, reaprendeu a cantar e passou os treze anos seguintes lutando por cada dia de vida, sempre com um sorriso para os fãs. E que, quando parecia ter vencido tudo, uma última batalha o levou a um hospital de Salvador, de onde ele não voltou.</w:t>
+        <w:t>O que pouca gente sabe é que ele sobreviveu, recuperou a voz e passou os anos seguintes enfrentando uma batalha atrás da outra pela própria saúde, sempre com um sorriso para os fãs. E que, quando parecia ter vencido tudo, uma última batalha o levou a um hospital de Salvador, de onde ele não voltou.</w:t>
       </w:r>
     </w:p>
     <w:p>
@@ -87,7 +87,7 @@
         <w:rPr>
           <w:color w:val="000000"/>
         </w:rPr>
-        <w:t>Para quem viveu os anos noventa, aquela canção nunca foi só uma música. Era trio elétrico, era verão, era a festa de casamento do primo, era o Carnaval que a gente via pela televisão. Uma música que atravessou o país e chegou a ganhar versões em mais de oito idiomas.</w:t>
+        <w:t>Para quem viveu os anos noventa, aquela canção era trio elétrico e verão. Era a festa de casamento do primo e o Carnaval que a gente via pela televisão. Uma música que atravessou o país e chegou a ganhar versões em mais de oito idiomas.</w:t>
       </w:r>
     </w:p>
     <w:p>
@@ -183,7 +183,7 @@
         <w:rPr>
           <w:color w:val="C00000"/>
         </w:rPr>
-        <w:t>E existe um detalhe nessa origem que ganhou um peso enorme no fim da vida dele. O ano em que ele nasceu, mil novecentos e sessenta e seis, ia virar o nome de um sonho que ele ainda carregava nos últimos meses. Um sonho que ele contou para os fãs com o maior entusiasmo, e que ficou esperando por ele.</w:t>
+        <w:t>E existe um detalhe nessa origem que ganhou um peso enorme no fim da vida dele. O ano em que ele nasceu, mil novecentos e sessenta e seis, ia virar o nome de um sonho que ele ainda carregava nos últimos meses. Um sonho que ele dividiu com os fãs, e que ficou esperando por ele.</w:t>
       </w:r>
     </w:p>
     <w:p>
@@ -207,7 +207,7 @@
         <w:rPr>
           <w:color w:val="000000"/>
         </w:rPr>
-        <w:t>Naquele Carnaval, ele subiu num trio elétrico em Salvador pela primeira vez como vocalista de uma banda chamada Banda Beijo.</w:t>
+        <w:t>Naquele Carnaval, em Salvador, ele estreou como vocalista de uma banda chamada Banda Beijo.</w:t>
       </w:r>
     </w:p>
     <w:p>

</xml_diff>

<commit_message>
Netinho: Parte 1 reescrita no padrão v3; PROMPT MESTRE v3
Co-Authored-By: Claude Opus 5.5 <noreply@anthropic.com>
Claude-Session: https://claude.ai/code/session_01MJjUEEZrxQDEUifKK2vj9g
</commit_message>
<xml_diff>
--- a/roteiros/netinho/Netinho_Parte1.docx
+++ b/roteiros/netinho/Netinho_Parte1.docx
@@ -15,7 +15,7 @@
         <w:rPr>
           <w:color w:val="C00000"/>
         </w:rPr>
-        <w:t>Netinho fez o Brasil inteiro cantar Milla nos anos noventa e virou um dos maiores nomes do axé. Mas, em dois mil e treze, o corpo dele entrou em colapso de um jeito que o deixou meses internado, entre a vida e a morte.</w:t>
+        <w:t>Treze de outubro de dois mil e vinte e seis. Uma terça-feira de manhã, em Salvador. Dentro de um quarto do Hospital Aliança Star, morreu o homem que fez o Brasil inteiro cantar Milla, depois de cinquenta e dois dias internado, longe das câmeras e longe dos fãs.</w:t>
       </w:r>
     </w:p>
     <w:p>
@@ -23,7 +23,7 @@
         <w:rPr>
           <w:color w:val="C00000"/>
         </w:rPr>
-        <w:t>O que pouca gente sabe é que ele sobreviveu, recuperou a voz e passou os anos seguintes enfrentando uma batalha atrás da outra pela própria saúde, sempre com um sorriso para os fãs. E que, quando parecia ter vencido tudo, uma última batalha o levou a um hospital de Salvador, de onde ele não voltou.</w:t>
+        <w:t>O que quase ninguém no Brasil ligou até hoje é que aquela manhã foi o fim de uma luta que tinha começado treze anos antes, com uma dor na coxa durante um ensaio. E que o mesmo lugar do corpo que avisou, em maio de dois mil e vinte e seis, que alguma coisa estava errada, foi exatamente o lugar que parou no final.</w:t>
       </w:r>
     </w:p>
     <w:p>
@@ -31,7 +31,7 @@
         <w:rPr>
           <w:color w:val="C00000"/>
         </w:rPr>
-        <w:t>Fique até o final, porque você vai conhecer a história de coragem que existia por trás do homem de Milla. E como foram os últimos dias do rei do axé, depois que ele saiu de cena para enfrentar a luta mais difícil da vida dele.</w:t>
+        <w:t>Fica até o final desse vídeo. Porque você vai descobrir o que o Netinho enfrentou em silêncio durante treze anos, sempre com um sorriso para os fãs. E qual foi a mensagem que ele publicou quando decidiu desaparecer das redes sociais.</w:t>
       </w:r>
     </w:p>
     <w:p>
@@ -39,7 +39,7 @@
         <w:rPr>
           <w:color w:val="000000"/>
         </w:rPr>
-        <w:t>Treze de outubro de dois mil e vinte e seis.</w:t>
+        <w:t>Mas antes de chegar àquele quarto de hospital em Salvador, tem uma coisa que você precisa entender. Porque o que aconteceu ali não começou em agosto de dois mil e vinte e seis. Começou muito antes. Começou com um rapaz do interior da Bahia que transformou a alegria em profissão. E que, para continuar fazendo o Brasil dançar, sorriu até nos dias em que mal conseguia ficar de pé.</w:t>
       </w:r>
     </w:p>
     <w:p>
@@ -47,7 +47,7 @@
         <w:rPr>
           <w:color w:val="000000"/>
         </w:rPr>
-        <w:t>Uma terça-feira de manhã, em Salvador.</w:t>
+        <w:t>Existe uma publicação feita pelo próprio Netinho numa terça-feira de agosto de dois mil e vinte e seis, poucos dias depois de uma sessão de quimioterapia. Uma publicação sobre um acidente dentro do banheiro de casa, que ele contou aos fãs fazendo piada. Nós vamos mostrar o que ele escreveu mais à frente.</w:t>
       </w:r>
     </w:p>
     <w:p>
@@ -55,7 +55,7 @@
         <w:rPr>
           <w:color w:val="000000"/>
         </w:rPr>
-        <w:t>A equipe de Netinho publicou uma nota nas redes sociais. Poucas linhas, que muita gente precisou ler duas vezes.</w:t>
+        <w:t>Existe uma frase que ele disse em dois mil e catorze, numa entrevista, depois de passar meses entre a vida e a morte. Seis palavras que, doze anos depois, ganharam um peso completamente diferente.</w:t>
       </w:r>
     </w:p>
     <w:p>
@@ -63,7 +63,7 @@
         <w:rPr>
           <w:color w:val="000000"/>
         </w:rPr>
-        <w:t>O cantor tinha morrido. Tinha sessenta anos.</w:t>
+        <w:t>E existe um sonho. Um projeto que ele anunciou com o ano em que nasceu, e que ficou esperando por ele do lado de fora daquele hospital.</w:t>
       </w:r>
     </w:p>
     <w:p>
@@ -71,7 +71,7 @@
         <w:rPr>
           <w:color w:val="000000"/>
         </w:rPr>
-        <w:t>Em poucos minutos, a notícia se espalhou pelo país. E, nas redes sociais, muita gente voltou para a mesma música.</w:t>
+        <w:t>Para entender tudo isso, é preciso voltar sessenta anos no tempo.</w:t>
       </w:r>
     </w:p>
     <w:p>
@@ -79,7 +79,7 @@
         <w:rPr>
           <w:color w:val="000000"/>
         </w:rPr>
-        <w:t>Milla.</w:t>
+        <w:t>Mil novecentos e sessenta e seis. Santo Antônio de Jesus, no Recôncavo Baiano. Uma terra de samba de roda e de festa de rua. Foi ali que nasceu Ernesto de Souza Andrade Júnior. O menino que o Brasil inteiro ia conhecer por um apelido carinhoso. Netinho.</w:t>
       </w:r>
     </w:p>
     <w:p>
@@ -87,7 +87,7 @@
         <w:rPr>
           <w:color w:val="000000"/>
         </w:rPr>
-        <w:t>Para quem viveu os anos noventa, aquela canção era trio elétrico e verão. Era a festa de casamento do primo e o Carnaval que a gente via pela televisão. Uma música que atravessou o país e chegou a ganhar versões em mais de oito idiomas.</w:t>
+        <w:t>Guarde esse ano. Mil novecentos e sessenta e seis. Porque, sessenta anos depois, nos últimos meses da vida dele, esse número ia virar o nome de um sonho.</w:t>
       </w:r>
     </w:p>
     <w:p>
@@ -95,7 +95,7 @@
         <w:rPr>
           <w:color w:val="000000"/>
         </w:rPr>
-        <w:t>Só que, por trás daquele refrão que todo mundo sabia de cor, existia um homem que vinha lutando pela própria vida havia muito tempo.</w:t>
+        <w:t>Na Bahia, onde o Carnaval é quase uma religião, a música deixou de ser só o que ele ouvia. Virou o que ele queria fazer da vida.</w:t>
       </w:r>
     </w:p>
     <w:p>
@@ -103,7 +103,191 @@
         <w:rPr>
           <w:color w:val="000000"/>
         </w:rPr>
-        <w:t>Muito mais tempo do que a maioria dos fãs imaginava.</w:t>
+        <w:t>Mil novecentos e oitenta e seis. Netinho tinha vinte anos. Fez um teste para ser vocalista de uma banda chamada Banda Beijo. Foi aprovado. E, naquele mesmo Carnaval, a Banda Beijo fez sucesso com uma música que tomou as ruas de Salvador. Beijo na Boca.</w:t>
+      </w:r>
+    </w:p>
+    <w:p>
+      <w:r>
+        <w:rPr>
+          <w:color w:val="000000"/>
+        </w:rPr>
+        <w:t>Era o nascimento de um movimento que ia mudar a música brasileira. Os jornais começavam a chamar aquele som de axé music. Trios elétricos, multidões pulando atrás das cordas, uma batida que misturava tudo o que a Bahia tinha.</w:t>
+      </w:r>
+    </w:p>
+    <w:p>
+      <w:r>
+        <w:rPr>
+          <w:color w:val="000000"/>
+        </w:rPr>
+        <w:t>E o rapaz do Recôncavo estava exatamente no meio daquela explosão.</w:t>
+      </w:r>
+    </w:p>
+    <w:p>
+      <w:r>
+        <w:rPr>
+          <w:color w:val="000000"/>
+        </w:rPr>
+        <w:t>E é aqui que a história começa a ficar arrepiante. Porque o mesmo corpo que, naquele Carnaval de mil novecentos e oitenta e seis, pulava em cima do trio por horas seguidas, ia ser, vinte e sete anos depois, o corpo que travou de dor no meio de um ensaio em Salvador. Uma dor que começou na coxa esquerda. E que abriu a porta para os meses mais sombrios da vida dele.</w:t>
+      </w:r>
+    </w:p>
+    <w:p>
+      <w:r>
+        <w:rPr>
+          <w:color w:val="000000"/>
+        </w:rPr>
+        <w:t>Abril de dois mil e treze. Guarde essa data também. Nós vamos voltar a ela.</w:t>
+      </w:r>
+    </w:p>
+    <w:p>
+      <w:r>
+        <w:rPr>
+          <w:color w:val="000000"/>
+        </w:rPr>
+        <w:t>Foram anos puxando multidões com a Banda Beijo. O Carnaval da Bahia é uma maratona, com dias seguidos cantando em cima do trio, debaixo de sol e de chuva. E, lá de cima, o público só vê o sorriso do cantor.</w:t>
+      </w:r>
+    </w:p>
+    <w:p>
+      <w:r>
+        <w:rPr>
+          <w:color w:val="000000"/>
+        </w:rPr>
+        <w:t>Só que ele queria mais do que ser o vocalista de uma banda.</w:t>
+      </w:r>
+    </w:p>
+    <w:p>
+      <w:r>
+        <w:rPr>
+          <w:color w:val="000000"/>
+        </w:rPr>
+        <w:t>Mil novecentos e noventa e três. Netinho deixou a Banda Beijo e começou a carreira solo. O primeiro disco se chamava Um Beijo Pra Você.</w:t>
+      </w:r>
+    </w:p>
+    <w:p>
+      <w:r>
+        <w:rPr>
+          <w:color w:val="000000"/>
+        </w:rPr>
+        <w:t>Vieram anos de estrada. Shows pelo interior do Nordeste, trios no Carnaval, programas de televisão. Músicas como Cohab City e Tanajura começaram a tocar nas rádios. Um passo de cada vez, o nome dele foi crescendo fora da Bahia.</w:t>
+      </w:r>
+    </w:p>
+    <w:p>
+      <w:r>
+        <w:rPr>
+          <w:color w:val="000000"/>
+        </w:rPr>
+        <w:t>Até que chegou o ano que mudou tudo.</w:t>
+      </w:r>
+    </w:p>
+    <w:p>
+      <w:r>
+        <w:rPr>
+          <w:color w:val="000000"/>
+        </w:rPr>
+        <w:t>Mil novecentos e noventa e seis. Aracaju, em Sergipe. Netinho subiu ao palco para gravar um disco ao vivo. Seria o oitavo álbum da carreira dele. O título era simples. Netinho ao Vivo.</w:t>
+      </w:r>
+    </w:p>
+    <w:p>
+      <w:r>
+        <w:rPr>
+          <w:color w:val="000000"/>
+        </w:rPr>
+        <w:t>Ninguém naquele show imaginava o que ia sair daquela gravação.</w:t>
+      </w:r>
+    </w:p>
+    <w:p>
+      <w:r>
+        <w:rPr>
+          <w:color w:val="000000"/>
+        </w:rPr>
+        <w:t>No meio do repertório, havia uma música sobre uma mulher chamada Milla.</w:t>
+      </w:r>
+    </w:p>
+    <w:p>
+      <w:r>
+        <w:rPr>
+          <w:color w:val="000000"/>
+        </w:rPr>
+        <w:t>Uma música com um refrão que qualquer pessoa conseguia cantar depois de ouvir uma vez só.</w:t>
+      </w:r>
+    </w:p>
+    <w:p>
+      <w:r>
+        <w:rPr>
+          <w:color w:val="000000"/>
+        </w:rPr>
+        <w:t>Em poucos meses, Milla estava em todas as rádios do Brasil. Nos trios do Carnaval, nas festas de casamento, nas formaturas, nas praias do verão. A música bateu recordes de execução e atravessou o oceano. Foi regravada em mais de oito idiomas. Chegou a ganhar até uma versão em russo.</w:t>
+      </w:r>
+    </w:p>
+    <w:p>
+      <w:r>
+        <w:rPr>
+          <w:color w:val="000000"/>
+        </w:rPr>
+        <w:t>Imagina você ser um rapaz do Recôncavo e, de repente, ouvir a sua voz tocando em todos os lugares do país ao mesmo tempo. No rádio do táxi, na televisão da padaria, no som do vizinho. Era isso que estava acontecendo com o Netinho em mil novecentos e noventa e seis.</w:t>
+      </w:r>
+    </w:p>
+    <w:p>
+      <w:r>
+        <w:rPr>
+          <w:color w:val="000000"/>
+        </w:rPr>
+        <w:t>Ele tinha trinta anos e era uma das vozes mais ouvidas do Brasil.</w:t>
+      </w:r>
+    </w:p>
+    <w:p>
+      <w:r>
+        <w:rPr>
+          <w:color w:val="000000"/>
+        </w:rPr>
+        <w:t>No ano seguinte, veio outro disco, Me Leva. E uma música dele, Pra Te Ter Aqui, entrou na trilha de uma novela da Globo, Corpo Dourado. O rapaz da Banda Beijo agora estava na trilha de uma novela.</w:t>
+      </w:r>
+    </w:p>
+    <w:p>
+      <w:r>
+        <w:rPr>
+          <w:color w:val="000000"/>
+        </w:rPr>
+        <w:t>Era o auge.</w:t>
+      </w:r>
+    </w:p>
+    <w:p>
+      <w:r>
+        <w:rPr>
+          <w:color w:val="000000"/>
+        </w:rPr>
+        <w:t>Só que existe uma coisa sobre o auge que quase nunca aparece nas fotos. O preço que o corpo paga para continuar lá em cima.</w:t>
+      </w:r>
+    </w:p>
+    <w:p>
+      <w:r>
+        <w:rPr>
+          <w:color w:val="000000"/>
+        </w:rPr>
+        <w:t>Exatamente dezessete anos. Esse foi o tempo entre aquele show em Aracaju, em mil novecentos e noventa e seis, e o ensaio em Salvador em que a coxa esquerda do Netinho travou de dor. Dezessete anos de trio elétrico, de turnês e de palco. E, quando o corpo finalmente cobrou, cobrou de uma vez só.</w:t>
+      </w:r>
+    </w:p>
+    <w:p>
+      <w:r>
+        <w:rPr>
+          <w:color w:val="000000"/>
+        </w:rPr>
+        <w:t>Anos depois, ao lembrar daquele período, ele resumiu tudo numa frase curta. "Vi a morte de muito perto."</w:t>
+      </w:r>
+    </w:p>
+    <w:p>
+      <w:r>
+        <w:rPr>
+          <w:color w:val="000000"/>
+        </w:rPr>
+        <w:t>Seis palavras. Ditas em dois mil e catorze, por um homem que tinha acabado de passar meses internado, que tinha perdido a fala e que tinha sofrido três AVCs.</w:t>
+      </w:r>
+    </w:p>
+    <w:p>
+      <w:r>
+        <w:rPr>
+          <w:color w:val="000000"/>
+        </w:rPr>
+        <w:t>Guarde essa frase. Porque, doze anos depois, de novo num hospital de Salvador, ela ia voltar com um peso que ninguém imaginava.</w:t>
       </w:r>
     </w:p>
     <w:p>
@@ -111,159 +295,7 @@
         <w:rPr>
           <w:color w:val="C00000"/>
         </w:rPr>
-        <w:t>Guarde essa data. Porque aquela terça-feira de outubro foi o último capítulo de uma luta que começou treze anos antes. Uma luta que ele enfrentou quase sempre sorrindo, mesmo nos dias em que mal conseguia ficar de pé.</w:t>
-      </w:r>
-    </w:p>
-    <w:p>
-      <w:r>
-        <w:rPr>
-          <w:color w:val="000000"/>
-        </w:rPr>
-        <w:t>Para entender essa história, é preciso voltar ao começo.</w:t>
-      </w:r>
-    </w:p>
-    <w:p>
-      <w:r>
-        <w:rPr>
-          <w:color w:val="000000"/>
-        </w:rPr>
-        <w:t>Ao interior da Bahia.</w:t>
-      </w:r>
-    </w:p>
-    <w:p>
-      <w:r>
-        <w:rPr>
-          <w:color w:val="000000"/>
-        </w:rPr>
-        <w:t>Santo Antônio de Jesus, no Recôncavo Baiano.</w:t>
-      </w:r>
-    </w:p>
-    <w:p>
-      <w:r>
-        <w:rPr>
-          <w:color w:val="000000"/>
-        </w:rPr>
-        <w:t>Foi ali que nasceu, em mil novecentos e sessenta e seis, Ernesto de Souza Andrade Júnior.</w:t>
-      </w:r>
-    </w:p>
-    <w:p>
-      <w:r>
-        <w:rPr>
-          <w:color w:val="000000"/>
-        </w:rPr>
-        <w:t>O menino que o Brasil inteiro ia conhecer por um apelido carinhoso.</w:t>
-      </w:r>
-    </w:p>
-    <w:p>
-      <w:r>
-        <w:rPr>
-          <w:color w:val="000000"/>
-        </w:rPr>
-        <w:t>Netinho.</w:t>
-      </w:r>
-    </w:p>
-    <w:p>
-      <w:r>
-        <w:rPr>
-          <w:color w:val="000000"/>
-        </w:rPr>
-        <w:t>O Recôncavo é uma das regiões mais musicais do país. Terra de samba de roda e de festa de rua. Foi nesse lugar que aquele garoto cresceu.</w:t>
-      </w:r>
-    </w:p>
-    <w:p>
-      <w:r>
-        <w:rPr>
-          <w:color w:val="000000"/>
-        </w:rPr>
-        <w:t>Com o tempo, a música virou o que ele queria fazer da vida.</w:t>
-      </w:r>
-    </w:p>
-    <w:p>
-      <w:r>
-        <w:rPr>
-          <w:color w:val="C00000"/>
-        </w:rPr>
-        <w:t>E existe um detalhe nessa origem que ganhou um peso enorme no fim da vida dele. O ano em que ele nasceu, mil novecentos e sessenta e seis, ia virar o nome de um sonho que ele ainda carregava nos últimos meses. Um sonho que ele dividiu com os fãs, e que ficou esperando por ele.</w:t>
-      </w:r>
-    </w:p>
-    <w:p>
-      <w:r>
-        <w:rPr>
-          <w:color w:val="000000"/>
-        </w:rPr>
-        <w:t>Mil novecentos e oitenta e seis.</w:t>
-      </w:r>
-    </w:p>
-    <w:p>
-      <w:r>
-        <w:rPr>
-          <w:color w:val="000000"/>
-        </w:rPr>
-        <w:t>Netinho tinha vinte anos.</w:t>
-      </w:r>
-    </w:p>
-    <w:p>
-      <w:r>
-        <w:rPr>
-          <w:color w:val="000000"/>
-        </w:rPr>
-        <w:t>Naquele Carnaval, em Salvador, ele estreou como vocalista de uma banda chamada Banda Beijo.</w:t>
-      </w:r>
-    </w:p>
-    <w:p>
-      <w:r>
-        <w:rPr>
-          <w:color w:val="000000"/>
-        </w:rPr>
-        <w:t>A Bahia vivia o nascimento de um movimento que ia mudar a música brasileira. Os jornais começavam a chamar aquele som de axé music.</w:t>
-      </w:r>
-    </w:p>
-    <w:p>
-      <w:r>
-        <w:rPr>
-          <w:color w:val="000000"/>
-        </w:rPr>
-        <w:t>A Banda Beijo gravou discos e ganhou espaço nas rádios e nos trios. O rapaz do Recôncavo estava no meio daquela explosão.</w:t>
-      </w:r>
-    </w:p>
-    <w:p>
-      <w:r>
-        <w:rPr>
-          <w:color w:val="000000"/>
-        </w:rPr>
-        <w:t>Só que ele queria mais.</w:t>
-      </w:r>
-    </w:p>
-    <w:p>
-      <w:r>
-        <w:rPr>
-          <w:color w:val="000000"/>
-        </w:rPr>
-        <w:t>Em mil novecentos e noventa e três, deixou a banda e começou a carreira solo. O primeiro disco se chamava Um Beijo Pra Você.</w:t>
-      </w:r>
-    </w:p>
-    <w:p>
-      <w:r>
-        <w:rPr>
-          <w:color w:val="000000"/>
-        </w:rPr>
-        <w:t>Vieram anos de estrada, de shows pelo interior e de trios no Carnaval. Um passo de cada vez.</w:t>
-      </w:r>
-    </w:p>
-    <w:p>
-      <w:r>
-        <w:rPr>
-          <w:color w:val="000000"/>
-        </w:rPr>
-        <w:t>Até que, em mil novecentos e noventa e seis, veio a música que mudou tudo.</w:t>
-      </w:r>
-    </w:p>
-    <w:p>
-      <w:r>
-        <w:rPr>
-          <w:color w:val="C00000"/>
-        </w:rPr>
-        <w:t>Uma música gravada ao vivo, num disco que ninguém imaginava que ia tão longe. Uma música que, trinta anos depois, ia ser a primeira coisa que o Brasil lembrou no dia da morte dele. E que, no meio do caminho, ainda ia trazer para Netinho algumas das maiores alegrias e alguns dos dias mais difíceis da vida dele.</w:t>
+        <w:t>Só que a carreira do rei do axé ainda ia dar muitas voltas antes daquele ensaio de abril de dois mil e treze. Uma pausa longe dos palcos, uma volta, novos discos. E, no meio de tudo isso, uma rotina com o próprio corpo que ele só teve coragem de revelar depois de quase morrer.</w:t>
       </w:r>
     </w:p>
     <w:sectPr>

</xml_diff>

<commit_message>
Netinho: revisão da Parte 1 (fatos e datas)
Co-Authored-By: Claude Opus 5.5 <noreply@anthropic.com>
Claude-Session: https://claude.ai/code/session_01MJjUEEZrxQDEUifKK2vj9g
</commit_message>
<xml_diff>
--- a/roteiros/netinho/Netinho_Parte1.docx
+++ b/roteiros/netinho/Netinho_Parte1.docx
@@ -31,7 +31,7 @@
         <w:rPr>
           <w:color w:val="C00000"/>
         </w:rPr>
-        <w:t>Fica até o final desse vídeo. Porque você vai descobrir o que o Netinho enfrentou em silêncio durante treze anos, sempre com um sorriso para os fãs.</w:t>
+        <w:t>Fica até o final desse vídeo. Porque você vai descobrir o que o Netinho enfrentou de verdade durante esses treze anos, por trás do sorriso que ele mostrava aos fãs.</w:t>
       </w:r>
     </w:p>
     <w:p>
@@ -47,7 +47,7 @@
         <w:rPr>
           <w:color w:val="000000"/>
         </w:rPr>
-        <w:t>Existe uma publicação feita pelo próprio Netinho numa terça-feira de agosto de dois mil e vinte e seis, poucos dias depois de uma sessão de quimioterapia. Uma publicação sobre um acidente dentro do banheiro de casa, que ele contou aos fãs fazendo piada. Nós vamos mostrar o que ele escreveu mais à frente.</w:t>
+        <w:t>Existe uma publicação feita pelo próprio Netinho numa terça-feira de agosto de dois mil e vinte e seis, poucos dias depois de uma sessão de quimioterapia. Uma publicação sobre um acidente dentro do banheiro, que ele contou aos fãs fazendo piada. Nós vamos mostrar o que ele escreveu mais à frente.</w:t>
       </w:r>
     </w:p>
     <w:p>
@@ -63,7 +63,7 @@
         <w:rPr>
           <w:color w:val="000000"/>
         </w:rPr>
-        <w:t>E existe um sonho. Um projeto que ele anunciou com o ano em que nasceu, e que ficou esperando por ele do lado de fora daquele hospital.</w:t>
+        <w:t>E existe um sonho. Um projeto batizado com o ano em que ele nasceu, e que ficou esperando por ele do lado de fora daquele hospital.</w:t>
       </w:r>
     </w:p>
     <w:p>
@@ -103,7 +103,7 @@
         <w:rPr>
           <w:color w:val="000000"/>
         </w:rPr>
-        <w:t>Mil novecentos e oitenta e seis. Netinho tinha vinte anos. Fez um teste para ser vocalista de uma banda chamada Banda Beijo. Foi aprovado. E, naquele mesmo Carnaval, a Banda Beijo fez sucesso com uma música que tomou as ruas de Salvador. Beijo na Boca.</w:t>
+        <w:t>Mil novecentos e oitenta e seis. Netinho ainda nem tinha completado vinte anos. Fez um teste para ser vocalista de uma banda chamada Banda Beijo. Foi aprovado. E, naquele mesmo Carnaval, a Banda Beijo fez sucesso com uma música que tomou as ruas de Salvador. Beijo na Boca.</w:t>
       </w:r>
     </w:p>
     <w:p>
@@ -111,7 +111,7 @@
         <w:rPr>
           <w:color w:val="000000"/>
         </w:rPr>
-        <w:t>Era o nascimento de um movimento que ia mudar a música brasileira. Os jornais começavam a chamar aquele som de axé music. Trios elétricos, multidões pulando atrás das cordas, uma batida que misturava tudo o que a Bahia tinha.</w:t>
+        <w:t>Era o nascimento de um movimento que ia mudar a música brasileira. Pouco tempo depois, aquele som ganharia um nome que o país inteiro ia aprender. Axé music. Trios elétricos, multidões pulando atrás das cordas, uma batida que misturava tudo o que a Bahia tinha.</w:t>
       </w:r>
     </w:p>
     <w:p>
@@ -167,7 +167,7 @@
         <w:rPr>
           <w:color w:val="000000"/>
         </w:rPr>
-        <w:t>Vieram anos de estrada. Shows pelo interior do Nordeste, trios no Carnaval, programas de televisão. Músicas como Cohab City e Tanajura começaram a tocar nas rádios. Um passo de cada vez, o nome dele foi crescendo fora da Bahia.</w:t>
+        <w:t>Vieram anos de estrada, de shows e de trios no Carnaval. Um passo de cada vez, o nome dele foi crescendo fora da Bahia.</w:t>
       </w:r>
     </w:p>
     <w:p>
@@ -231,7 +231,7 @@
         <w:rPr>
           <w:color w:val="000000"/>
         </w:rPr>
-        <w:t>Ele tinha trinta anos e era uma das vozes mais ouvidas do Brasil.</w:t>
+        <w:t>Ele tinha por volta de trinta anos e era uma das vozes mais ouvidas do Brasil.</w:t>
       </w:r>
     </w:p>
     <w:p>
@@ -247,7 +247,7 @@
         <w:rPr>
           <w:color w:val="000000"/>
         </w:rPr>
-        <w:t>Era o auge.</w:t>
+        <w:t>Era o auge. Nos anos noventa, ele ainda emplacou outras músicas, como Cohab City e Tanajura.</w:t>
       </w:r>
     </w:p>
     <w:p>
@@ -263,7 +263,7 @@
         <w:rPr>
           <w:color w:val="000000"/>
         </w:rPr>
-        <w:t>Exatamente dezessete anos. Esse foi o tempo entre aquele show em Aracaju, em mil novecentos e noventa e seis, e o ensaio em Salvador em que a coxa esquerda do Netinho travou de dor. Dezessete anos de trio elétrico, de turnês e de palco. E, quando o corpo finalmente cobrou, cobrou de uma vez só.</w:t>
+        <w:t>Exatamente dezessete anos. Esse foi o tempo entre aquele show em Aracaju, em mil novecentos e noventa e seis, e o ensaio em Salvador em que a coxa esquerda do Netinho travou de dor. Dezessete anos de trio elétrico, de turnês e de palco. E, quando o corpo finalmente deu o sinal, foi de uma vez só.</w:t>
       </w:r>
     </w:p>
     <w:p>
@@ -271,7 +271,7 @@
         <w:rPr>
           <w:color w:val="000000"/>
         </w:rPr>
-        <w:t>Anos depois, ao lembrar daquele período, ele resumiu tudo numa frase curta. "Vi a morte de muito perto."</w:t>
+        <w:t>Menos de um ano depois, ao lembrar daquele período, ele resumiu tudo numa frase curta. "Vi a morte de muito perto."</w:t>
       </w:r>
     </w:p>
     <w:p>

</xml_diff>

<commit_message>
Netinho: Parte 4 (2025 a agosto de 2026) e correção da data da internação final
Co-Authored-By: Claude Opus 5.5 <noreply@anthropic.com>
Claude-Session: https://claude.ai/code/session_01MJjUEEZrxQDEUifKK2vj9g
</commit_message>
<xml_diff>
--- a/roteiros/netinho/Netinho_Parte1.docx
+++ b/roteiros/netinho/Netinho_Parte1.docx
@@ -15,7 +15,7 @@
         <w:rPr>
           <w:color w:val="C00000"/>
         </w:rPr>
-        <w:t>Treze de outubro de dois mil e vinte e seis. Uma terça-feira de manhã, em Salvador. Dentro de um quarto do Hospital Aliança Star, morreu o homem que fez o Brasil inteiro cantar Milla, depois de cinquenta e dois dias internado, longe das câmeras e longe dos fãs.</w:t>
+        <w:t>Treze de outubro de dois mil e vinte e seis. Uma terça-feira de manhã, em Salvador. Dentro de um quarto do Hospital Aliança Star, morreu o homem que fez o Brasil inteiro cantar Milla. Longe das câmeras e longe dos fãs.</w:t>
       </w:r>
     </w:p>
     <w:p>
@@ -39,7 +39,7 @@
         <w:rPr>
           <w:color w:val="000000"/>
         </w:rPr>
-        <w:t>Mas antes de chegar àquele quarto de hospital em Salvador, tem uma coisa que você precisa entender. Porque o que aconteceu ali não começou em agosto de dois mil e vinte e seis. Começou muito antes. Começou com um rapaz do interior da Bahia que transformou a alegria em profissão. E que, para continuar fazendo o Brasil dançar, sorriu até nos dias em que mal conseguia ficar de pé.</w:t>
+        <w:t>Mas antes de chegar àquele quarto de hospital em Salvador, tem uma coisa que você precisa entender. Porque o que aconteceu ali não começou naquele hospital. Começou muito antes. Começou com um rapaz do interior da Bahia que transformou a alegria em profissão. E que, para continuar fazendo o Brasil dançar, sorriu até nos dias em que mal conseguia ficar de pé.</w:t>
       </w:r>
     </w:p>
     <w:p>
@@ -47,7 +47,7 @@
         <w:rPr>
           <w:color w:val="000000"/>
         </w:rPr>
-        <w:t>Existe uma publicação feita pelo próprio Netinho numa terça-feira de agosto de dois mil e vinte e seis, poucos dias depois de uma sessão de quimioterapia. Uma publicação sobre um acidente dentro do banheiro, que ele contou aos fãs fazendo piada. Nós vamos mostrar o que ele escreveu mais à frente.</w:t>
+        <w:t>Existe uma publicação feita pelo próprio Netinho em agosto de dois mil e vinte e seis, poucos dias depois de uma sessão de quimioterapia. Uma publicação sobre um acidente dentro do banheiro, que ele contou aos fãs fazendo piada. Nós vamos mostrar o que ele escreveu mais à frente.</w:t>
       </w:r>
     </w:p>
     <w:p>

</xml_diff>

<commit_message>
Netinho: polimento de retenção (cortes de trechos lentos, transições entre partes)
Co-Authored-By: Claude Opus 5.5 <noreply@anthropic.com>
Claude-Session: https://claude.ai/code/session_01MJjUEEZrxQDEUifKK2vj9g
</commit_message>
<xml_diff>
--- a/roteiros/netinho/Netinho_Parte1.docx
+++ b/roteiros/netinho/Netinho_Parte1.docx
@@ -143,7 +143,7 @@
         <w:rPr>
           <w:color w:val="000000"/>
         </w:rPr>
-        <w:t>Foram anos puxando multidões com a Banda Beijo. O Carnaval da Bahia é uma maratona, com dias seguidos cantando em cima do trio, debaixo de sol e de chuva. E, lá de cima, o público só vê o sorriso do cantor.</w:t>
+        <w:t>Foram anos puxando multidões com a Banda Beijo. Dias seguidos em cima do trio, debaixo de sol e de chuva. E, lá de cima, o público só via uma coisa. O sorriso do cantor.</w:t>
       </w:r>
     </w:p>
     <w:p>
@@ -167,15 +167,7 @@
         <w:rPr>
           <w:color w:val="000000"/>
         </w:rPr>
-        <w:t>Vieram anos de estrada, de shows e de trios no Carnaval. Um passo de cada vez, o nome dele foi crescendo fora da Bahia.</w:t>
-      </w:r>
-    </w:p>
-    <w:p>
-      <w:r>
-        <w:rPr>
-          <w:color w:val="000000"/>
-        </w:rPr>
-        <w:t>Até que chegou o ano que mudou tudo.</w:t>
+        <w:t>Três anos depois, chegou o ano que mudou tudo.</w:t>
       </w:r>
     </w:p>
     <w:p>
@@ -239,7 +231,7 @@
         <w:rPr>
           <w:color w:val="000000"/>
         </w:rPr>
-        <w:t>No ano seguinte, veio outro disco, Me Leva. E uma música dele, Pra Te Ter Aqui, entrou na trilha de uma novela da Globo, Corpo Dourado. O rapaz da Banda Beijo agora estava na trilha de uma novela.</w:t>
+        <w:t>No ano seguinte, uma música dele, Pra Te Ter Aqui, entrou na trilha de Corpo Dourado, novela da Globo. Vieram outros sucessos, como Cohab City e Tanajura.</w:t>
       </w:r>
     </w:p>
     <w:p>
@@ -247,7 +239,7 @@
         <w:rPr>
           <w:color w:val="000000"/>
         </w:rPr>
-        <w:t>Era o auge. Nos anos noventa, ele ainda emplacou outras músicas, como Cohab City e Tanajura.</w:t>
+        <w:t>Era o auge.</w:t>
       </w:r>
     </w:p>
     <w:p>

</xml_diff>

<commit_message>
Netinho: novos ganchos de retenção nos trechos mais longos sem gancho
Co-Authored-By: Claude Opus 5.5 <noreply@anthropic.com>
Claude-Session: https://claude.ai/code/session_01MJjUEEZrxQDEUifKK2vj9g
</commit_message>
<xml_diff>
--- a/roteiros/netinho/Netinho_Parte1.docx
+++ b/roteiros/netinho/Netinho_Parte1.docx
@@ -88,14 +88,6 @@
           <w:color w:val="000000"/>
         </w:rPr>
         <w:t>Guarde esse ano. Mil novecentos e sessenta e seis. Porque, sessenta anos depois, nos últimos meses da vida dele, esse número ia virar o nome de um sonho.</w:t>
-      </w:r>
-    </w:p>
-    <w:p>
-      <w:r>
-        <w:rPr>
-          <w:color w:val="000000"/>
-        </w:rPr>
-        <w:t>Na Bahia, onde o Carnaval é quase uma religião, a música deixou de ser só o que ele ouvia. Virou o que ele queria fazer da vida.</w:t>
       </w:r>
     </w:p>
     <w:p>

</xml_diff>

<commit_message>
Netinho: roteiro reconstruído na nova estrutura (hook de 10 s, grandes ganchos em azul, iscas, duplo impacto, 8.500 palavras)
Co-Authored-By: Claude Opus 5.5 <noreply@anthropic.com>
Claude-Session: https://claude.ai/code/session_01MJjUEEZrxQDEUifKK2vj9g
</commit_message>
<xml_diff>
--- a/roteiros/netinho/Netinho_Parte1.docx
+++ b/roteiros/netinho/Netinho_Parte1.docx
@@ -15,7 +15,7 @@
         <w:rPr>
           <w:color w:val="C00000"/>
         </w:rPr>
-        <w:t>Treze de outubro de dois mil e vinte e seis. Uma terça-feira de manhã, em Salvador. Dentro de um quarto do Hospital Aliança Star, morreu o homem que fez o Brasil inteiro cantar Milla. Longe das câmeras e longe dos fãs.</w:t>
+        <w:t>Treze de outubro de dois mil e vinte e seis. A voz de Milla se calou num quarto de hospital em Salvador.</w:t>
       </w:r>
     </w:p>
     <w:p>
@@ -23,7 +23,7 @@
         <w:rPr>
           <w:color w:val="C00000"/>
         </w:rPr>
-        <w:t>O que quase ninguém no Brasil ligou até hoje é que aquela manhã foi o último capítulo de uma luta que tinha começado treze anos antes, num dia comum de trabalho, sem nenhum aviso. E que, poucos meses antes do fim, um exame feito por outro motivo revelou uma coisa que ninguém esperava encontrar dentro do corpo dele.</w:t>
+        <w:t>O que ninguém ligou até hoje é que essa morte dolorosa começou treze anos antes, com um segredo que ele mesmo escondeu atrás do sorriso.</w:t>
       </w:r>
     </w:p>
     <w:p>
@@ -31,7 +31,7 @@
         <w:rPr>
           <w:color w:val="C00000"/>
         </w:rPr>
-        <w:t>Fica até o final desse vídeo. Porque você vai descobrir o que o Netinho enfrentou de verdade durante esses treze anos, por trás do sorriso que ele mostrava aos fãs.</w:t>
+        <w:t>Fica até o final. Você vai saber que segredo era esse. E o que um exame encontrou dentro do corpo dele, poucos meses antes do fim.</w:t>
       </w:r>
     </w:p>
     <w:p>
@@ -39,7 +39,7 @@
         <w:rPr>
           <w:color w:val="000000"/>
         </w:rPr>
-        <w:t>Mas antes de chegar àquele quarto de hospital em Salvador, tem uma coisa que você precisa entender. Porque o que aconteceu ali não começou naquele hospital. Começou muito antes. Começou com um rapaz do interior da Bahia que transformou a alegria em profissão. E que, para continuar fazendo o Brasil dançar, sorriu até nos dias em que mal conseguia ficar de pé.</w:t>
+        <w:t>Mas antes de chegar àquele quarto, tem uma coisa que você precisa entender. O que aconteceu ali começou muito antes. Começou em cima de um caminhão de som, debaixo do sol da Bahia, com um rapaz que aprendeu cedo que o público só enxerga uma coisa no cantor. O sorriso.</w:t>
       </w:r>
     </w:p>
     <w:p>
@@ -47,7 +47,7 @@
         <w:rPr>
           <w:color w:val="000000"/>
         </w:rPr>
-        <w:t>Existe uma publicação feita pelo próprio Netinho em agosto de dois mil e vinte e seis, poucos dias depois de uma sessão de quimioterapia. Uma publicação sobre um acidente dentro do banheiro, que ele contou aos fãs fazendo piada. Nós vamos mostrar o que ele escreveu mais à frente.</w:t>
+        <w:t>Esse sorriso vai atravessar toda essa história. Nos dias de glória e nos dias em que ele mal conseguia ficar de pé.</w:t>
       </w:r>
     </w:p>
     <w:p>
@@ -55,7 +55,7 @@
         <w:rPr>
           <w:color w:val="000000"/>
         </w:rPr>
-        <w:t>Existe uma frase que ele disse em dois mil e catorze, numa entrevista, depois de passar meses entre a vida e a morte. Seis palavras que, doze anos depois, ganharam um peso completamente diferente.</w:t>
+        <w:t>Ao longo desse vídeo, quatro coisas vão aparecer na sua frente.</w:t>
       </w:r>
     </w:p>
     <w:p>
@@ -63,7 +63,7 @@
         <w:rPr>
           <w:color w:val="000000"/>
         </w:rPr>
-        <w:t>E existe um sonho. Um projeto batizado com o ano em que ele nasceu, e que ficou esperando por ele do lado de fora daquele hospital.</w:t>
+        <w:t>Um boletim médico assinado numa noite de sábado, dentro de uma UTI em São Paulo, com o nome verdadeiro dele escrito por extenso.</w:t>
       </w:r>
     </w:p>
     <w:p>
@@ -71,7 +71,7 @@
         <w:rPr>
           <w:color w:val="000000"/>
         </w:rPr>
-        <w:t>Para entender tudo isso, é preciso voltar sessenta anos no tempo.</w:t>
+        <w:t>Uma foto tirada dentro dessa mesma UTI. O próprio Netinho guardou essa foto. E, meses depois, deu a ela um nome que ninguém esperava.</w:t>
       </w:r>
     </w:p>
     <w:p>
@@ -79,7 +79,7 @@
         <w:rPr>
           <w:color w:val="000000"/>
         </w:rPr>
-        <w:t>Mil novecentos e sessenta e seis. Santo Antônio de Jesus, no Recôncavo Baiano. Uma terra de samba de roda e de festa de rua. Foi ali que nasceu Ernesto de Souza Andrade Júnior. O menino que o Brasil inteiro ia conhecer por um apelido carinhoso. Netinho.</w:t>
+        <w:t>Uma toalha esquecida num banheiro, numa terça-feira de agosto de dois mil e vinte e seis. Parece um detalhe bobo. Você vai entender por que não é.</w:t>
       </w:r>
     </w:p>
     <w:p>
@@ -87,7 +87,15 @@
         <w:rPr>
           <w:color w:val="000000"/>
         </w:rPr>
-        <w:t>Guarde esse ano. Mil novecentos e sessenta e seis. Porque, sessenta anos depois, nos últimos meses da vida dele, esse número ia virar o nome de um sonho.</w:t>
+        <w:t>E um show escrito no papel, batizado com o ano em que ele nasceu. Um show que ele chamou de o mais lindo da vida dele.</w:t>
+      </w:r>
+    </w:p>
+    <w:p>
+      <w:r>
+        <w:rPr>
+          <w:color w:val="C00000"/>
+        </w:rPr>
+        <w:t>Vamos voltar a cada uma dessas coisas. E uma delas explica, sozinha, por que ele escondia a dor atrás de uma piada.</w:t>
       </w:r>
     </w:p>
     <w:p>
@@ -95,7 +103,7 @@
         <w:rPr>
           <w:color w:val="000000"/>
         </w:rPr>
-        <w:t>Mil novecentos e oitenta e seis. Netinho ainda nem tinha completado vinte anos. Fez um teste para ser vocalista de uma banda chamada Banda Beijo. Foi aprovado. E, naquele mesmo Carnaval, a Banda Beijo fez sucesso com uma música que tomou as ruas de Salvador. Beijo na Boca.</w:t>
+        <w:t>Mil novecentos e sessenta e seis. Santo Antônio de Jesus, no Recôncavo Baiano, terra de samba de roda e de festa de rua. Ali nasceu Ernesto de Souza Andrade Júnior.</w:t>
       </w:r>
     </w:p>
     <w:p>
@@ -103,7 +111,7 @@
         <w:rPr>
           <w:color w:val="000000"/>
         </w:rPr>
-        <w:t>Era o nascimento de um movimento que ia mudar a música brasileira. Pouco tempo depois, aquele som ganharia um nome que o país inteiro ia aprender. Axé music. Trios elétricos, multidões pulando atrás das cordas, uma batida que misturava tudo o que a Bahia tinha.</w:t>
+        <w:t>Guarde esse nome. Ernesto. Quase ninguém no Brasil chamava ele assim. Quem chamava, conhecia o homem por trás do palco. E esse nome vai voltar no último capítulo dessa história, na boca de uma das maiores cantoras do país.</w:t>
       </w:r>
     </w:p>
     <w:p>
@@ -111,7 +119,7 @@
         <w:rPr>
           <w:color w:val="000000"/>
         </w:rPr>
-        <w:t>E o rapaz do Recôncavo estava exatamente no meio daquela explosão.</w:t>
+        <w:t>O Brasil conheceu o menino por um apelido. Netinho.</w:t>
       </w:r>
     </w:p>
     <w:p>
@@ -119,7 +127,7 @@
         <w:rPr>
           <w:color w:val="000000"/>
         </w:rPr>
-        <w:t>E é aqui que a história começa a ficar arrepiante. Porque o mesmo corpo que, naquele Carnaval de mil novecentos e oitenta e seis, pulava em cima do trio por horas seguidas, ia ser, vinte e sete anos depois, o corpo que travou de dor no meio de um ensaio em Salvador. Uma dor que começou na coxa esquerda. E que abriu a porta para os meses mais sombrios da vida dele.</w:t>
+        <w:t>Anos oitenta. Netinho tinha uns vinte anos quando virou a voz de uma banda de Salvador chamada Banda Beijo. Foi com ela que estourou nas ruas do Carnaval uma música chamada Beijo na Boca. A Banda Beijo foi a primeira banda baiana a se apresentar no Domingão do Faustão.</w:t>
       </w:r>
     </w:p>
     <w:p>
@@ -127,7 +135,15 @@
         <w:rPr>
           <w:color w:val="000000"/>
         </w:rPr>
-        <w:t>Abril de dois mil e treze. Guarde essa data também. Nós vamos voltar a ela.</w:t>
+        <w:t>Era o começo de um som que, pouco tempo depois, ganharia o nome de axé music. Trio elétrico na rua e multidão pulando por horas atrás do caminhão.</w:t>
+      </w:r>
+    </w:p>
+    <w:p>
+      <w:r>
+        <w:rPr>
+          <w:color w:val="C00000"/>
+        </w:rPr>
+        <w:t>E é aqui que a história começa a ficar arrepiante. Aquele rapaz que pulava em cima do trio nos Carnavais dos anos oitenta ia ver o próprio corpo travar, mais de vinte e cinco anos depois, no meio do trabalho. Uma dor na coxa esquerda que abriu a porta para os meses mais sombrios da vida dele.</w:t>
       </w:r>
     </w:p>
     <w:p>
@@ -135,7 +151,7 @@
         <w:rPr>
           <w:color w:val="000000"/>
         </w:rPr>
-        <w:t>Foram anos puxando multidões com a Banda Beijo. Dias seguidos em cima do trio, debaixo de sol e de chuva. E, lá de cima, o público só via uma coisa. O sorriso do cantor.</w:t>
+        <w:t>Foram anos puxando multidão com a Banda Beijo. Dias seguidos em cima do trio, debaixo de sol e de chuva. Lá de baixo, o público só via o sorriso.</w:t>
       </w:r>
     </w:p>
     <w:p>
@@ -143,7 +159,15 @@
         <w:rPr>
           <w:color w:val="000000"/>
         </w:rPr>
-        <w:t>Só que ele queria mais do que ser o vocalista de uma banda.</w:t>
+        <w:t>Mil novecentos e noventa e três. Netinho largou a banda e arriscou a carreira solo. O primeiro disco tinha um nome que dizia muito sobre ele. Um Beijo Pra Você. Ganhou disco de platina. Uma das faixas se chamava Beija-Me.</w:t>
+      </w:r>
+    </w:p>
+    <w:p>
+      <w:r>
+        <w:rPr>
+          <w:color w:val="C00000"/>
+        </w:rPr>
+        <w:t>Guarde essa música. Trinta e dois anos depois, numa fase em que ele quase não tinha voz, foi justamente ela que ele escolheu cantar.</w:t>
       </w:r>
     </w:p>
     <w:p>
@@ -151,7 +175,7 @@
         <w:rPr>
           <w:color w:val="000000"/>
         </w:rPr>
-        <w:t>Mil novecentos e noventa e três. Netinho deixou a Banda Beijo e começou a carreira solo. O primeiro disco se chamava Um Beijo Pra Você.</w:t>
+        <w:t>Em mil novecentos e noventa e cinco, ele já gravava discos entre São Paulo, Rio de Janeiro e Los Angeles. Três anos depois do primeiro disco solo, chegou o ano que mudou tudo.</w:t>
       </w:r>
     </w:p>
     <w:p>
@@ -159,7 +183,7 @@
         <w:rPr>
           <w:color w:val="000000"/>
         </w:rPr>
-        <w:t>Três anos depois, chegou o ano que mudou tudo.</w:t>
+        <w:t>Mil novecentos e noventa e seis. Aracaju, em Sergipe. Netinho subiu ao palco para gravar um disco ao vivo, o oitavo da carreira. O título era simples. Netinho ao Vivo.</w:t>
       </w:r>
     </w:p>
     <w:p>
@@ -167,7 +191,7 @@
         <w:rPr>
           <w:color w:val="000000"/>
         </w:rPr>
-        <w:t>Mil novecentos e noventa e seis. Aracaju, em Sergipe. Netinho subiu ao palco para gravar um disco ao vivo. Seria o oitavo álbum da carreira dele. O título era simples. Netinho ao Vivo.</w:t>
+        <w:t>No meio do repertório, havia uma música sobre uma mulher chamada Milla. Um refrão que qualquer pessoa cantava depois de ouvir uma vez só.</w:t>
       </w:r>
     </w:p>
     <w:p>
@@ -175,7 +199,7 @@
         <w:rPr>
           <w:color w:val="000000"/>
         </w:rPr>
-        <w:t>Ninguém naquele show imaginava o que ia sair daquela gravação.</w:t>
+        <w:t>Em poucos meses, Milla tomou o país. O disco Netinho ao Vivo chegou a vender mais de três milhões de cópias. Tocou nos trios do Carnaval e nas festas de casamento do país inteiro. Bateu recordes de execução nas rádios, foi regravada em mais de oito idiomas e chegou a ganhar até uma versão em russo.</w:t>
       </w:r>
     </w:p>
     <w:p>
@@ -183,7 +207,7 @@
         <w:rPr>
           <w:color w:val="000000"/>
         </w:rPr>
-        <w:t>No meio do repertório, havia uma música sobre uma mulher chamada Milla.</w:t>
+        <w:t>Milla nasceu na voz de uma banda baiana chamada Jheremmias Não Bate Corner, e quem escreveu foi o compositor Manno Góes. Quem transformou a música num hino foi a voz do Netinho, gravada ao vivo naquela noite em Aracaju.</w:t>
       </w:r>
     </w:p>
     <w:p>
@@ -191,7 +215,7 @@
         <w:rPr>
           <w:color w:val="000000"/>
         </w:rPr>
-        <w:t>Uma música com um refrão que qualquer pessoa conseguia cantar depois de ouvir uma vez só.</w:t>
+        <w:t>Naquele mesmo ano, a Câmara de Aracaju deu a ele o título de cidadão da cidade.</w:t>
       </w:r>
     </w:p>
     <w:p>
@@ -199,7 +223,15 @@
         <w:rPr>
           <w:color w:val="000000"/>
         </w:rPr>
-        <w:t>Em poucos meses, Milla estava em todas as rádios do Brasil. Nos trios do Carnaval, nas festas de casamento, nas formaturas, nas praias do verão. A música bateu recordes de execução e atravessou o oceano. Foi regravada em mais de oito idiomas. Chegou a ganhar até uma versão em russo.</w:t>
+        <w:t>Guarde essa cidade. Aracaju. Quase trinta anos depois, já lutando contra um câncer, era para lá que ele sonhava voltar.</w:t>
+      </w:r>
+    </w:p>
+    <w:p>
+      <w:r>
+        <w:rPr>
+          <w:color w:val="C00000"/>
+        </w:rPr>
+        <w:t>Imagina você ser aquele rapaz do Recôncavo. Você entra num táxi e a sua voz está tocando no rádio. Chega em casa e o vizinho está cantando a sua música no último volume.</w:t>
       </w:r>
     </w:p>
     <w:p>
@@ -207,7 +239,7 @@
         <w:rPr>
           <w:color w:val="000000"/>
         </w:rPr>
-        <w:t>Imagina você ser um rapaz do Recôncavo e, de repente, ouvir a sua voz tocando em todos os lugares do país ao mesmo tempo. No rádio do táxi, na televisão da padaria, no som do vizinho. Era isso que estava acontecendo com o Netinho em mil novecentos e noventa e seis.</w:t>
+        <w:t>Era isso que acontecia com o Netinho em mil novecentos e noventa e seis. Ele tinha por volta de trinta anos e era uma das vozes mais ouvidas do Brasil.</w:t>
       </w:r>
     </w:p>
     <w:p>
@@ -215,7 +247,7 @@
         <w:rPr>
           <w:color w:val="000000"/>
         </w:rPr>
-        <w:t>Ele tinha por volta de trinta anos e era uma das vozes mais ouvidas do Brasil.</w:t>
+        <w:t>No ano seguinte, a música Pra Te Ter Aqui entrou na trilha de Corpo Dourado, novela da Globo. Em mil novecentos e noventa e oito, ele chegou a aparecer na própria novela, cantando num show exibido no capítulo cinquenta e seis. Vieram outros sucessos, como Cohab City e Tanajura. A voz dele já tinha passado por novelas como Mulheres de Areia e Tropicaliente, e até pela Malhação.</w:t>
       </w:r>
     </w:p>
     <w:p>
@@ -223,7 +255,7 @@
         <w:rPr>
           <w:color w:val="000000"/>
         </w:rPr>
-        <w:t>No ano seguinte, uma música dele, Pra Te Ter Aqui, entrou na trilha de Corpo Dourado, novela da Globo. Vieram outros sucessos, como Cohab City e Tanajura.</w:t>
+        <w:t>Em mil novecentos e noventa e nove, ele gravou até uma versão em português de uma música de Phil Collins.</w:t>
       </w:r>
     </w:p>
     <w:p>
@@ -237,7 +269,7 @@
     <w:p>
       <w:r>
         <w:rPr>
-          <w:color w:val="000000"/>
+          <w:color w:val="C00000"/>
         </w:rPr>
         <w:t>Só que existe uma coisa sobre o auge que quase nunca aparece nas fotos. O preço que o corpo paga para continuar lá em cima.</w:t>
       </w:r>
@@ -247,7 +279,7 @@
         <w:rPr>
           <w:color w:val="000000"/>
         </w:rPr>
-        <w:t>Exatamente dezessete anos. Esse foi o tempo entre aquele show em Aracaju, em mil novecentos e noventa e seis, e o ensaio em Salvador em que a coxa esquerda do Netinho travou de dor. Dezessete anos de trio elétrico, de turnês e de palco. E, quando o corpo finalmente deu o sinal, foi de uma vez só.</w:t>
+        <w:t>Dois mil e três. Netinho gravou um disco chamado Zuêra e pediu que ele não fosse lançado. Fez o que pouca gente esperava no auge da carreira. Parou. Se afastou dos shows, da televisão e do rádio. Segundo a Wikipédia, para passar mais tempo com a família. A filha dele, Bruna, ainda era pequena.</w:t>
       </w:r>
     </w:p>
     <w:p>
@@ -255,7 +287,7 @@
         <w:rPr>
           <w:color w:val="000000"/>
         </w:rPr>
-        <w:t>Menos de um ano depois, ao lembrar daquele período, ele resumiu tudo numa frase curta. "Vi a morte de muito perto."</w:t>
+        <w:t>Ninguém que nasceu para cima de um trio elétrico consegue ficar muito tempo longe dele. Ele voltou aos palcos e aos Carnavais. Em dois mil e seis, gravou um DVD chamado Netinho por Inteiro, com uma convidada que vai aparecer de novo nesta história nos momentos mais duros. Ivete Sangalo. Em dois mil e nove, o disco Minha Praia foi indicado ao Grammy Latino.</w:t>
       </w:r>
     </w:p>
     <w:p>
@@ -263,7 +295,7 @@
         <w:rPr>
           <w:color w:val="000000"/>
         </w:rPr>
-        <w:t>Seis palavras. Ditas em dois mil e catorze, por um homem que tinha acabado de passar meses internado, que tinha perdido a fala e que tinha sofrido três AVCs.</w:t>
+        <w:t>Os anos foram passando. A plateia continuava querendo o homem dos anos noventa, com o mesmo corpo e a mesma energia. Os artistas ao lado dele no trio eram cada vez mais jovens.</w:t>
       </w:r>
     </w:p>
     <w:p>
@@ -271,7 +303,7 @@
         <w:rPr>
           <w:color w:val="000000"/>
         </w:rPr>
-        <w:t>Guarde essa frase. Porque, doze anos depois, de novo num hospital de Salvador, ela ia voltar com um peso que ninguém imaginava.</w:t>
+        <w:t>Nas fotos daquela época, o Netinho aparecia cada vez mais forte. O Brasil se acostumou com um cantor musculoso, de braço de fora em cima do trio.</w:t>
       </w:r>
     </w:p>
     <w:p>
@@ -279,7 +311,95 @@
         <w:rPr>
           <w:color w:val="C00000"/>
         </w:rPr>
-        <w:t>Só que a carreira do rei do axé ainda ia dar muitas voltas antes daquele ensaio de abril de dois mil e treze. Uma pausa longe dos palcos, uma volta, novos discos. E, no meio de tudo isso, uma rotina com o próprio corpo que ele só teve coragem de revelar depois de quase morrer.</w:t>
+        <w:t>Imagina passar dos quarenta anos e ter que subir num trio debaixo do sol de Salvador, cantando por horas, sabendo que milhares de pessoas estão esperando exatamente o homem que você era aos trinta.</w:t>
+      </w:r>
+    </w:p>
+    <w:p>
+      <w:r>
+        <w:rPr>
+          <w:color w:val="000000"/>
+        </w:rPr>
+        <w:t>Foi nesses anos de volta que começou o segredo que esse vídeo prometeu. Uma decisão que ele tomou dentro de um consultório em São Paulo, e que o Brasil só ia conhecer quando ele já estivesse numa cama de UTI.</w:t>
+      </w:r>
+    </w:p>
+    <w:p>
+      <w:r>
+        <w:rPr>
+          <w:color w:val="C00000"/>
+        </w:rPr>
+        <w:t>Guarde isso na sua cabeça. Dois verões. O de dois mil e nove e o de dois mil e dez. Lá na frente, você vai entender o peso dessas duas datas.</w:t>
+      </w:r>
+    </w:p>
+    <w:p>
+      <w:r>
+        <w:rPr>
+          <w:color w:val="000000"/>
+        </w:rPr>
+        <w:t>Abril de dois mil e treze. Salvador. Netinho estava trabalhando, cantando com a banda, numa rotina que ele tinha repetido milhares de vezes. Meses depois, na televisão, ele descreveu o momento exato.</w:t>
+      </w:r>
+    </w:p>
+    <w:p>
+      <w:r>
+        <w:rPr>
+          <w:color w:val="000000"/>
+        </w:rPr>
+        <w:t>"Sentei no banco para cantar e quando levantei, não consegui ficar em pé."</w:t>
+      </w:r>
+    </w:p>
+    <w:p>
+      <w:r>
+        <w:rPr>
+          <w:color w:val="000000"/>
+        </w:rPr>
+        <w:t>Uma dor forte tinha atravessado a coxa esquerda. A perna travou.</w:t>
+      </w:r>
+    </w:p>
+    <w:p>
+      <w:r>
+        <w:rPr>
+          <w:color w:val="000000"/>
+        </w:rPr>
+        <w:t>O homem que tinha passado mais de vinte e cinco anos pulando em cima de trio elétrico estava parado, sem conseguir andar.</w:t>
+      </w:r>
+    </w:p>
+    <w:p>
+      <w:r>
+        <w:rPr>
+          <w:color w:val="C00000"/>
+        </w:rPr>
+        <w:t>Ninguém ali imaginava que aquela dor era a primeira peça de uma luta que ia durar exatamente treze anos.</w:t>
+      </w:r>
+    </w:p>
+    <w:p>
+      <w:r>
+        <w:rPr>
+          <w:color w:val="000000"/>
+        </w:rPr>
+        <w:t>Netinho foi levado ao Hospital Aliança, em Salvador.</w:t>
+      </w:r>
+    </w:p>
+    <w:p>
+      <w:r>
+        <w:rPr>
+          <w:color w:val="000000"/>
+        </w:rPr>
+        <w:t>Guarde também esse nome. Aliança. Ele vai aparecer de novo, mais de uma vez, sempre nos piores momentos.</w:t>
+      </w:r>
+    </w:p>
+    <w:p>
+      <w:r>
+        <w:rPr>
+          <w:color w:val="000000"/>
+        </w:rPr>
+        <w:t>Os médicos começaram uma longa série de exames. Precisavam descobrir de onde vinha aquela dor. Ele lembraria depois. "Fui direto para o hospital, onde comecei uma bateria de exames. Nunca fiz tantos exames na minha vida." Fizeram biópsias. Uma na coxa. Outra no fígado.</w:t>
+      </w:r>
+    </w:p>
+    <w:p>
+      <w:r>
+        <w:rPr>
+          <w:color w:val="C00000"/>
+        </w:rPr>
+        <w:t>E foi aí que tudo começou a dar errado.</w:t>
       </w:r>
     </w:p>
     <w:sectPr>

</xml_diff>